<commit_message>
- Prima scrittura delle ultime query - Correzione delle differenze di alcuni nomi tra di loro
</commit_message>
<xml_diff>
--- a/Modello Relazionale.docx
+++ b/Modello Relazionale.docx
@@ -352,7 +352,14 @@
           <w:bCs/>
           <w:u w:val="single"/>
         </w:rPr>
-        <w:t>ID_Materiali</w:t>
+        <w:t>ID_Material</w:t>
+      </w:r>
+      <w:r>
+        <w:rPr>
+          <w:bCs/>
+          <w:u w:val="single"/>
+        </w:rPr>
+        <w:t>e</w:t>
       </w:r>
       <w:r>
         <w:rPr>
@@ -845,7 +852,14 @@
           <w:bCs/>
           <w:u w:val="single"/>
         </w:rPr>
-        <w:t>ID_Materiali</w:t>
+        <w:t>ID_Material</w:t>
+      </w:r>
+      <w:r>
+        <w:rPr>
+          <w:bCs/>
+          <w:u w:val="single"/>
+        </w:rPr>
+        <w:t>e</w:t>
       </w:r>
       <w:r>
         <w:rPr>
@@ -922,7 +936,25 @@
         <w:rPr>
           <w:b/>
         </w:rPr>
-        <w:t>MSSIONI_COMPLETATE</w:t>
+        <w:t>M</w:t>
+      </w:r>
+      <w:r>
+        <w:rPr>
+          <w:b/>
+        </w:rPr>
+        <w:t>I</w:t>
+      </w:r>
+      <w:r>
+        <w:rPr>
+          <w:b/>
+        </w:rPr>
+        <w:t>SSIONI_</w:t>
+      </w:r>
+      <w:r>
+        <w:rPr>
+          <w:b/>
+        </w:rPr>
+        <w:t>CONCLUSE</w:t>
       </w:r>
       <w:r>
         <w:rPr>

</xml_diff>